<commit_message>
Add execution screenshots to report and docs/screenshots
Seven evidence images rendered from the saved outputs of the executed
Colab notebook (no output edited) plus the repo history, inserted into
Appendix A of the report in place of the placeholders.
</commit_message>
<xml_diff>
--- a/docs/report/Maia2_Reproduction_Report.docx
+++ b/docs/report/Maia2_Reproduction_Report.docx
@@ -165,7 +165,7 @@
         </w:rPr>
         <w:t xml:space="preserve">Code and results: </w:t>
       </w:r>
-      <w:hyperlink w:history="1" r:id="rIdelbpw4ybruue585fxoo7r">
+      <w:hyperlink w:history="1" r:id="rIdavbkf1ngc8l71wjapwwg4">
         <w:r>
           <w:rPr>
             <w:rStyle w:val="Hyperlink"/>
@@ -8615,7 +8615,7 @@
       <w:r>
         <w:t xml:space="preserve">Repository: </w:t>
       </w:r>
-      <w:hyperlink w:history="1" r:id="rIdisgttnttytpkl6v5ebz32">
+      <w:hyperlink w:history="1" r:id="rIdfu2blfd7qbsgrnucpvgt_">
         <w:r>
           <w:rPr>
             <w:rStyle w:val="Hyperlink"/>
@@ -9207,94 +9207,481 @@
     </w:p>
     <w:p>
       <w:pPr>
+        <w:pStyle w:val="Heading2"/>
+      </w:pPr>
+      <w:r>
+        <w:t xml:space="preserve">Execution screenshots</w:t>
+      </w:r>
+    </w:p>
+    <w:p>
+      <w:pPr>
         <w:spacing w:after="120" w:line="276"/>
       </w:pPr>
       <w:r>
+        <w:t xml:space="preserve">Screenshots 1–6 are rendered from the outputs saved in the executed notebook (</w:t>
+      </w:r>
+      <w:r>
         <w:rPr>
-          <w:b/>
-          <w:bCs/>
+          <w:rFonts w:ascii="Consolas" w:cs="Consolas" w:eastAsia="Consolas" w:hAnsi="Consolas"/>
+          <w:sz w:val="19"/>
+          <w:szCs w:val="19"/>
         </w:rPr>
-        <w:t xml:space="preserve">Screenshots of the run</w:t>
-      </w:r>
-      <w:r>
-        <w:t xml:space="preserve"> (inserted by the team):</w:t>
-      </w:r>
-    </w:p>
-    <w:p>
-      <w:pPr>
-        <w:spacing w:after="60"/>
-      </w:pPr>
+        <w:t xml:space="preserve">notebooks/maia2_reproduction.ipynb</w:t>
+      </w:r>
+      <w:r>
+        <w:t xml:space="preserve">), which ran on Google Colab with a Tesla T4 GPU on 25 October 2026. No output was edited; where a long output is shortened, the omitted part is marked in the image and is available in full in the repository. Screenshot 7 shows the repository's git history and files. The same images are in </w:t>
+      </w:r>
       <w:r>
         <w:rPr>
-          <w:color w:val="C00000"/>
+          <w:rFonts w:ascii="Consolas" w:cs="Consolas" w:eastAsia="Consolas" w:hAnsi="Consolas"/>
+          <w:sz w:val="19"/>
+          <w:szCs w:val="19"/>
         </w:rPr>
-        <w:t xml:space="preserve">[Insert screenshot 1: Environment cell: GPU, versions, nvidia-smi]</w:t>
-      </w:r>
-    </w:p>
-    <w:p>
-      <w:pPr>
-        <w:spacing w:after="60"/>
+        <w:t xml:space="preserve">docs/screenshots/</w:t>
+      </w:r>
+      <w:r>
+        <w:t xml:space="preserve">.</w:t>
+      </w:r>
+    </w:p>
+    <w:p>
+      <w:pPr>
+        <w:keepNext/>
+        <w:spacing w:before="120"/>
+        <w:jc w:val="center"/>
+      </w:pPr>
+      <w:r>
+        <w:drawing>
+          <wp:inline distT="0" distB="0" distL="0" distR="0">
+            <wp:extent cx="5667375" cy="5562600"/>
+            <wp:effectExtent t="0" r="0" b="0" l="0"/>
+            <wp:docPr id="1" name="01_environment.png" descr="Screenshot 1. Software environment record and nvidia-smi output (Tesla T4)." title="Screenshot 1. Software environment record and nvidia-smi output (Tesla T4)."/>
+            <wp:cNvGraphicFramePr>
+              <a:graphicFrameLocks xmlns:a="http://schemas.openxmlformats.org/drawingml/2006/main" noChangeAspect="1"/>
+            </wp:cNvGraphicFramePr>
+            <a:graphic xmlns:a="http://schemas.openxmlformats.org/drawingml/2006/main">
+              <a:graphicData uri="http://schemas.openxmlformats.org/drawingml/2006/picture">
+                <pic:pic xmlns:pic="http://schemas.openxmlformats.org/drawingml/2006/picture">
+                  <pic:nvPicPr>
+                    <pic:cNvPr id="0" name="" descr=""/>
+                    <pic:cNvPicPr>
+                      <a:picLocks noChangeAspect="1" noChangeArrowheads="1"/>
+                    </pic:cNvPicPr>
+                  </pic:nvPicPr>
+                  <pic:blipFill>
+                    <a:blip r:embed="rId14" cstate="none"/>
+                    <a:srcRect/>
+                    <a:stretch>
+                      <a:fillRect/>
+                    </a:stretch>
+                  </pic:blipFill>
+                  <pic:spPr bwMode="auto">
+                    <a:xfrm>
+                      <a:off x="0" y="0"/>
+                      <a:ext cx="5667375" cy="5562600"/>
+                    </a:xfrm>
+                    <a:prstGeom prst="rect">
+                      <a:avLst/>
+                    </a:prstGeom>
+                  </pic:spPr>
+                </pic:pic>
+              </a:graphicData>
+            </a:graphic>
+          </wp:inline>
+        </w:drawing>
+      </w:r>
+    </w:p>
+    <w:p>
+      <w:pPr>
+        <w:spacing w:after="200" w:before="60"/>
+        <w:jc w:val="center"/>
       </w:pPr>
       <w:r>
         <w:rPr>
-          <w:color w:val="C00000"/>
+          <w:i/>
+          <w:iCs/>
+          <w:color w:val="52514E"/>
+          <w:sz w:val="18"/>
+          <w:szCs w:val="18"/>
         </w:rPr>
-        <w:t xml:space="preserve">[Insert screenshot 2: Dataset cell: test group sizes match the paper; training data audit]</w:t>
-      </w:r>
-    </w:p>
-    <w:p>
-      <w:pPr>
-        <w:spacing w:after="60"/>
+        <w:t xml:space="preserve">Screenshot 1. Software environment record and nvidia-smi output (Tesla T4).</w:t>
+      </w:r>
+    </w:p>
+    <w:p>
+      <w:pPr>
+        <w:keepNext/>
+        <w:spacing w:before="120"/>
+        <w:jc w:val="center"/>
+      </w:pPr>
+      <w:r>
+        <w:drawing>
+          <wp:inline distT="0" distB="0" distL="0" distR="0">
+            <wp:extent cx="5667375" cy="4191000"/>
+            <wp:effectExtent t="0" r="0" b="0" l="0"/>
+            <wp:docPr id="1" name="02_dataset.png" descr="Screenshot 2. Dataset download and checks: test-group sizes identical to the paper, training-data audit, zero train/test overlap." title="Screenshot 2. Dataset download and checks: test-group sizes identical to the paper, training-data audit, zero train/test overlap."/>
+            <wp:cNvGraphicFramePr>
+              <a:graphicFrameLocks xmlns:a="http://schemas.openxmlformats.org/drawingml/2006/main" noChangeAspect="1"/>
+            </wp:cNvGraphicFramePr>
+            <a:graphic xmlns:a="http://schemas.openxmlformats.org/drawingml/2006/main">
+              <a:graphicData uri="http://schemas.openxmlformats.org/drawingml/2006/picture">
+                <pic:pic xmlns:pic="http://schemas.openxmlformats.org/drawingml/2006/picture">
+                  <pic:nvPicPr>
+                    <pic:cNvPr id="0" name="" descr=""/>
+                    <pic:cNvPicPr>
+                      <a:picLocks noChangeAspect="1" noChangeArrowheads="1"/>
+                    </pic:cNvPicPr>
+                  </pic:nvPicPr>
+                  <pic:blipFill>
+                    <a:blip r:embed="rId15" cstate="none"/>
+                    <a:srcRect/>
+                    <a:stretch>
+                      <a:fillRect/>
+                    </a:stretch>
+                  </pic:blipFill>
+                  <pic:spPr bwMode="auto">
+                    <a:xfrm>
+                      <a:off x="0" y="0"/>
+                      <a:ext cx="5667375" cy="4191000"/>
+                    </a:xfrm>
+                    <a:prstGeom prst="rect">
+                      <a:avLst/>
+                    </a:prstGeom>
+                  </pic:spPr>
+                </pic:pic>
+              </a:graphicData>
+            </a:graphic>
+          </wp:inline>
+        </w:drawing>
+      </w:r>
+    </w:p>
+    <w:p>
+      <w:pPr>
+        <w:spacing w:after="200" w:before="60"/>
+        <w:jc w:val="center"/>
       </w:pPr>
       <w:r>
         <w:rPr>
-          <w:color w:val="C00000"/>
+          <w:i/>
+          <w:iCs/>
+          <w:color w:val="52514E"/>
+          <w:sz w:val="18"/>
+          <w:szCs w:val="18"/>
         </w:rPr>
-        <w:t xml:space="preserve">[Insert screenshot 3: Table 1 reproduction output]</w:t>
-      </w:r>
-    </w:p>
-    <w:p>
-      <w:pPr>
-        <w:spacing w:after="60"/>
+        <w:t xml:space="preserve">Screenshot 2. Dataset download and checks: test-group sizes identical to the paper, training-data audit, zero train/test overlap.</w:t>
+      </w:r>
+    </w:p>
+    <w:p>
+      <w:pPr>
+        <w:keepNext/>
+        <w:spacing w:before="120"/>
+        <w:jc w:val="center"/>
+      </w:pPr>
+      <w:r>
+        <w:drawing>
+          <wp:inline distT="0" distB="0" distL="0" distR="0">
+            <wp:extent cx="5667375" cy="3581400"/>
+            <wp:effectExtent t="0" r="0" b="0" l="0"/>
+            <wp:docPr id="1" name="03_table1_reproduction.png" descr="Screenshot 3. Table 1 reproduction with the official checkpoint on all 106,740 test positions." title="Screenshot 3. Table 1 reproduction with the official checkpoint on all 106,740 test positions."/>
+            <wp:cNvGraphicFramePr>
+              <a:graphicFrameLocks xmlns:a="http://schemas.openxmlformats.org/drawingml/2006/main" noChangeAspect="1"/>
+            </wp:cNvGraphicFramePr>
+            <a:graphic xmlns:a="http://schemas.openxmlformats.org/drawingml/2006/main">
+              <a:graphicData uri="http://schemas.openxmlformats.org/drawingml/2006/picture">
+                <pic:pic xmlns:pic="http://schemas.openxmlformats.org/drawingml/2006/picture">
+                  <pic:nvPicPr>
+                    <pic:cNvPr id="0" name="" descr=""/>
+                    <pic:cNvPicPr>
+                      <a:picLocks noChangeAspect="1" noChangeArrowheads="1"/>
+                    </pic:cNvPicPr>
+                  </pic:nvPicPr>
+                  <pic:blipFill>
+                    <a:blip r:embed="rId16" cstate="none"/>
+                    <a:srcRect/>
+                    <a:stretch>
+                      <a:fillRect/>
+                    </a:stretch>
+                  </pic:blipFill>
+                  <pic:spPr bwMode="auto">
+                    <a:xfrm>
+                      <a:off x="0" y="0"/>
+                      <a:ext cx="5667375" cy="3581400"/>
+                    </a:xfrm>
+                    <a:prstGeom prst="rect">
+                      <a:avLst/>
+                    </a:prstGeom>
+                  </pic:spPr>
+                </pic:pic>
+              </a:graphicData>
+            </a:graphic>
+          </wp:inline>
+        </w:drawing>
+      </w:r>
+    </w:p>
+    <w:p>
+      <w:pPr>
+        <w:spacing w:after="200" w:before="60"/>
+        <w:jc w:val="center"/>
       </w:pPr>
       <w:r>
         <w:rPr>
-          <w:color w:val="C00000"/>
+          <w:i/>
+          <w:iCs/>
+          <w:color w:val="52514E"/>
+          <w:sz w:val="18"/>
+          <w:szCs w:val="18"/>
         </w:rPr>
-        <w:t xml:space="preserve">[Insert screenshot 4: Training log ending with exit code 0]</w:t>
-      </w:r>
-    </w:p>
-    <w:p>
-      <w:pPr>
-        <w:spacing w:after="60"/>
+        <w:t xml:space="preserve">Screenshot 3. Table 1 reproduction with the official checkpoint on all 106,740 test positions.</w:t>
+      </w:r>
+    </w:p>
+    <w:p>
+      <w:pPr>
+        <w:keepNext/>
+        <w:spacing w:before="120"/>
+        <w:jc w:val="center"/>
+      </w:pPr>
+      <w:r>
+        <w:drawing>
+          <wp:inline distT="0" distB="0" distL="0" distR="0">
+            <wp:extent cx="5667375" cy="4533900"/>
+            <wp:effectExtent t="0" r="0" b="0" l="0"/>
+            <wp:docPr id="1" name="04_training_log.png" descr="Screenshot 4. Own training with the official trainer: start of the log, final chunks of epoch 3 and exit code 0." title="Screenshot 4. Own training with the official trainer: start of the log, final chunks of epoch 3 and exit code 0."/>
+            <wp:cNvGraphicFramePr>
+              <a:graphicFrameLocks xmlns:a="http://schemas.openxmlformats.org/drawingml/2006/main" noChangeAspect="1"/>
+            </wp:cNvGraphicFramePr>
+            <a:graphic xmlns:a="http://schemas.openxmlformats.org/drawingml/2006/main">
+              <a:graphicData uri="http://schemas.openxmlformats.org/drawingml/2006/picture">
+                <pic:pic xmlns:pic="http://schemas.openxmlformats.org/drawingml/2006/picture">
+                  <pic:nvPicPr>
+                    <pic:cNvPr id="0" name="" descr=""/>
+                    <pic:cNvPicPr>
+                      <a:picLocks noChangeAspect="1" noChangeArrowheads="1"/>
+                    </pic:cNvPicPr>
+                  </pic:nvPicPr>
+                  <pic:blipFill>
+                    <a:blip r:embed="rId17" cstate="none"/>
+                    <a:srcRect/>
+                    <a:stretch>
+                      <a:fillRect/>
+                    </a:stretch>
+                  </pic:blipFill>
+                  <pic:spPr bwMode="auto">
+                    <a:xfrm>
+                      <a:off x="0" y="0"/>
+                      <a:ext cx="5667375" cy="4533900"/>
+                    </a:xfrm>
+                    <a:prstGeom prst="rect">
+                      <a:avLst/>
+                    </a:prstGeom>
+                  </pic:spPr>
+                </pic:pic>
+              </a:graphicData>
+            </a:graphic>
+          </wp:inline>
+        </w:drawing>
+      </w:r>
+    </w:p>
+    <w:p>
+      <w:pPr>
+        <w:spacing w:after="200" w:before="60"/>
+        <w:jc w:val="center"/>
       </w:pPr>
       <w:r>
         <w:rPr>
-          <w:color w:val="C00000"/>
+          <w:i/>
+          <w:iCs/>
+          <w:color w:val="52514E"/>
+          <w:sz w:val="18"/>
+          <w:szCs w:val="18"/>
         </w:rPr>
-        <w:t xml:space="preserve">[Insert screenshot 5: Own training accuracy per epoch]</w:t>
-      </w:r>
-    </w:p>
-    <w:p>
-      <w:pPr>
-        <w:spacing w:after="60"/>
+        <w:t xml:space="preserve">Screenshot 4. Own training with the official trainer: start of the log, final chunks of epoch 3 and exit code 0.</w:t>
+      </w:r>
+    </w:p>
+    <w:p>
+      <w:pPr>
+        <w:keepNext/>
+        <w:spacing w:before="120"/>
+        <w:jc w:val="center"/>
+      </w:pPr>
+      <w:r>
+        <w:drawing>
+          <wp:inline distT="0" distB="0" distL="0" distR="0">
+            <wp:extent cx="5667375" cy="3362325"/>
+            <wp:effectExtent t="0" r="0" b="0" l="0"/>
+            <wp:docPr id="1" name="05_own_training_epochs.png" descr="Screenshot 5. The own-trained model evaluated on the full test set after each epoch." title="Screenshot 5. The own-trained model evaluated on the full test set after each epoch."/>
+            <wp:cNvGraphicFramePr>
+              <a:graphicFrameLocks xmlns:a="http://schemas.openxmlformats.org/drawingml/2006/main" noChangeAspect="1"/>
+            </wp:cNvGraphicFramePr>
+            <a:graphic xmlns:a="http://schemas.openxmlformats.org/drawingml/2006/main">
+              <a:graphicData uri="http://schemas.openxmlformats.org/drawingml/2006/picture">
+                <pic:pic xmlns:pic="http://schemas.openxmlformats.org/drawingml/2006/picture">
+                  <pic:nvPicPr>
+                    <pic:cNvPr id="0" name="" descr=""/>
+                    <pic:cNvPicPr>
+                      <a:picLocks noChangeAspect="1" noChangeArrowheads="1"/>
+                    </pic:cNvPicPr>
+                  </pic:nvPicPr>
+                  <pic:blipFill>
+                    <a:blip r:embed="rId18" cstate="none"/>
+                    <a:srcRect/>
+                    <a:stretch>
+                      <a:fillRect/>
+                    </a:stretch>
+                  </pic:blipFill>
+                  <pic:spPr bwMode="auto">
+                    <a:xfrm>
+                      <a:off x="0" y="0"/>
+                      <a:ext cx="5667375" cy="3362325"/>
+                    </a:xfrm>
+                    <a:prstGeom prst="rect">
+                      <a:avLst/>
+                    </a:prstGeom>
+                  </pic:spPr>
+                </pic:pic>
+              </a:graphicData>
+            </a:graphic>
+          </wp:inline>
+        </w:drawing>
+      </w:r>
+    </w:p>
+    <w:p>
+      <w:pPr>
+        <w:spacing w:after="200" w:before="60"/>
+        <w:jc w:val="center"/>
       </w:pPr>
       <w:r>
         <w:rPr>
-          <w:color w:val="C00000"/>
+          <w:i/>
+          <w:iCs/>
+          <w:color w:val="52514E"/>
+          <w:sz w:val="18"/>
+          <w:szCs w:val="18"/>
         </w:rPr>
-        <w:t xml:space="preserve">[Insert screenshot 6: Final comparison table]</w:t>
-      </w:r>
-    </w:p>
-    <w:p>
-      <w:pPr>
-        <w:spacing w:after="60"/>
+        <w:t xml:space="preserve">Screenshot 5. The own-trained model evaluated on the full test set after each epoch.</w:t>
+      </w:r>
+    </w:p>
+    <w:p>
+      <w:pPr>
+        <w:keepNext/>
+        <w:spacing w:before="120"/>
+        <w:jc w:val="center"/>
+      </w:pPr>
+      <w:r>
+        <w:drawing>
+          <wp:inline distT="0" distB="0" distL="0" distR="0">
+            <wp:extent cx="5667375" cy="3409950"/>
+            <wp:effectExtent t="0" r="0" b="0" l="0"/>
+            <wp:docPr id="1" name="06_final_comparison.png" descr="Screenshot 6. Final comparison table with differences from the paper." title="Screenshot 6. Final comparison table with differences from the paper."/>
+            <wp:cNvGraphicFramePr>
+              <a:graphicFrameLocks xmlns:a="http://schemas.openxmlformats.org/drawingml/2006/main" noChangeAspect="1"/>
+            </wp:cNvGraphicFramePr>
+            <a:graphic xmlns:a="http://schemas.openxmlformats.org/drawingml/2006/main">
+              <a:graphicData uri="http://schemas.openxmlformats.org/drawingml/2006/picture">
+                <pic:pic xmlns:pic="http://schemas.openxmlformats.org/drawingml/2006/picture">
+                  <pic:nvPicPr>
+                    <pic:cNvPr id="0" name="" descr=""/>
+                    <pic:cNvPicPr>
+                      <a:picLocks noChangeAspect="1" noChangeArrowheads="1"/>
+                    </pic:cNvPicPr>
+                  </pic:nvPicPr>
+                  <pic:blipFill>
+                    <a:blip r:embed="rId19" cstate="none"/>
+                    <a:srcRect/>
+                    <a:stretch>
+                      <a:fillRect/>
+                    </a:stretch>
+                  </pic:blipFill>
+                  <pic:spPr bwMode="auto">
+                    <a:xfrm>
+                      <a:off x="0" y="0"/>
+                      <a:ext cx="5667375" cy="3409950"/>
+                    </a:xfrm>
+                    <a:prstGeom prst="rect">
+                      <a:avLst/>
+                    </a:prstGeom>
+                  </pic:spPr>
+                </pic:pic>
+              </a:graphicData>
+            </a:graphic>
+          </wp:inline>
+        </w:drawing>
+      </w:r>
+    </w:p>
+    <w:p>
+      <w:pPr>
+        <w:spacing w:after="200" w:before="60"/>
+        <w:jc w:val="center"/>
       </w:pPr>
       <w:r>
         <w:rPr>
-          <w:color w:val="C00000"/>
+          <w:i/>
+          <w:iCs/>
+          <w:color w:val="52514E"/>
+          <w:sz w:val="18"/>
+          <w:szCs w:val="18"/>
         </w:rPr>
-        <w:t xml:space="preserve">[Insert screenshot 7: GitHub repository page]</w:t>
+        <w:t xml:space="preserve">Screenshot 6. Final comparison table with differences from the paper.</w:t>
+      </w:r>
+    </w:p>
+    <w:p>
+      <w:pPr>
+        <w:keepNext/>
+        <w:spacing w:before="120"/>
+        <w:jc w:val="center"/>
+      </w:pPr>
+      <w:r>
+        <w:drawing>
+          <wp:inline distT="0" distB="0" distL="0" distR="0">
+            <wp:extent cx="5667375" cy="4067175"/>
+            <wp:effectExtent t="0" r="0" b="0" l="0"/>
+            <wp:docPr id="1" name="07_github_repository.png" descr="Screenshot 7. Team repository: remote URL, commit history and tracked files." title="Screenshot 7. Team repository: remote URL, commit history and tracked files."/>
+            <wp:cNvGraphicFramePr>
+              <a:graphicFrameLocks xmlns:a="http://schemas.openxmlformats.org/drawingml/2006/main" noChangeAspect="1"/>
+            </wp:cNvGraphicFramePr>
+            <a:graphic xmlns:a="http://schemas.openxmlformats.org/drawingml/2006/main">
+              <a:graphicData uri="http://schemas.openxmlformats.org/drawingml/2006/picture">
+                <pic:pic xmlns:pic="http://schemas.openxmlformats.org/drawingml/2006/picture">
+                  <pic:nvPicPr>
+                    <pic:cNvPr id="0" name="" descr=""/>
+                    <pic:cNvPicPr>
+                      <a:picLocks noChangeAspect="1" noChangeArrowheads="1"/>
+                    </pic:cNvPicPr>
+                  </pic:nvPicPr>
+                  <pic:blipFill>
+                    <a:blip r:embed="rId20" cstate="none"/>
+                    <a:srcRect/>
+                    <a:stretch>
+                      <a:fillRect/>
+                    </a:stretch>
+                  </pic:blipFill>
+                  <pic:spPr bwMode="auto">
+                    <a:xfrm>
+                      <a:off x="0" y="0"/>
+                      <a:ext cx="5667375" cy="4067175"/>
+                    </a:xfrm>
+                    <a:prstGeom prst="rect">
+                      <a:avLst/>
+                    </a:prstGeom>
+                  </pic:spPr>
+                </pic:pic>
+              </a:graphicData>
+            </a:graphic>
+          </wp:inline>
+        </w:drawing>
+      </w:r>
+    </w:p>
+    <w:p>
+      <w:pPr>
+        <w:spacing w:after="200" w:before="60"/>
+        <w:jc w:val="center"/>
+      </w:pPr>
+      <w:r>
+        <w:rPr>
+          <w:i/>
+          <w:iCs/>
+          <w:color w:val="52514E"/>
+          <w:sz w:val="18"/>
+          <w:szCs w:val="18"/>
+        </w:rPr>
+        <w:t xml:space="preserve">Screenshot 7. Team repository: remote URL, commit history and tracked files.</w:t>
       </w:r>
     </w:p>
     <w:sectPr>

</xml_diff>